<commit_message>
Add ML/NLP track (ai_classify, topic discovery, comparison) and update docs + diagrams
</commit_message>
<xml_diff>
--- a/GM_VOC_POC_Summary.docx
+++ b/GM_VOC_POC_Summary.docx
@@ -37,13 +37,19 @@
     <w:p>
       <w:r>
         <w:rPr/>
-        <w:t xml:space="preserve">A system that replicates GM's Qualtrics XM Discover topic-tagging on Databricks. It takes contact-center call transcripts sentence by sentence, applies GM's existing rule-based topic model, and outputs which topics each sentence matches — so Databricks results can be validated 1:1 against the current Qualtrics control set.</w:t>
-      </w:r>
-    </w:p>
-    <w:p>
-      <w:r>
-        <w:rPr/>
-        <w:t xml:space="preserve">Core design decision: the matching logic is pure Python with zero dependencies, so the exact same code runs inside a Spark job at scale on Databricks and can be unit-tested locally without a cluster.</w:t>
+        <w:t xml:space="preserve">A system that classifies GM contact-center call transcripts by topic on Databricks, using two complementary tracks: (1) a deterministic rule engine that faithfully replicates GM's Qualtrics XM Discover logic, and (2) an ML / NLP track built on Databricks' native AI functions (ai_classify, ai_analyze_sentiment, ai_query embeddings, ai_gen). Both operate at sentence grain so results can be validated against the current Qualtrics control set.</w:t>
+      </w:r>
+    </w:p>
+    <w:p>
+      <w:r>
+        <w:rPr/>
+        <w:t xml:space="preserve">Track 1 design decision: the matching logic is pure Python with zero dependencies, so the exact same code runs inside a Spark job at scale on Databricks and can be unit-tested locally without a cluster.</w:t>
+      </w:r>
+    </w:p>
+    <w:p>
+      <w:r>
+        <w:rPr/>
+        <w:t xml:space="preserve">Track 2 rationale: Databricks AI functions provide a lighter-weight alternative to a custom ML model — nothing to train, host, or retrain — so GM does not own long-term model maintenance. The rule engine remains the deterministic control the ML track is regressed against.</w:t>
       </w:r>
     </w:p>
     <w:p>
@@ -135,7 +141,13 @@
       </w:pPr>
       <w:r>
         <w:rPr/>
-        <w:t xml:space="preserve">3. Files — core engine</w:t>
+        <w:t xml:space="preserve">3. The three classification approaches</w:t>
+      </w:r>
+    </w:p>
+    <w:p>
+      <w:r>
+        <w:rPr/>
+        <w:t xml:space="preserve">The POC evaluates whether Databricks can replicate and improve on GM's XM Discover tagging, so three methods were built, from most deterministic to most ML, plus a job that compares them.</w:t>
       </w:r>
     </w:p>
     <w:tbl>
@@ -162,7 +174,7 @@
               <w:rPr>
                 <w:b/>
               </w:rPr>
-              <w:t xml:space="preserve">File</w:t>
+              <w:t xml:space="preserve">Approach</w:t>
             </w:r>
           </w:p>
         </w:tc>
@@ -176,115 +188,123 @@
               <w:rPr>
                 <w:b/>
               </w:rPr>
-              <w:t xml:space="preserve">Purpose</w:t>
-            </w:r>
-          </w:p>
-        </w:tc>
-      </w:tr>
-      <w:tr>
-        <w:tc>
-          <w:tcPr>
-            <w:tcW w:w="4600" w:type="dxa"/>
-          </w:tcPr>
-          <w:p>
-            <w:r>
-              <w:rPr/>
-              <w:t xml:space="preserve">rule_engine.py</w:t>
-            </w:r>
-          </w:p>
-        </w:tc>
-        <w:tc>
-          <w:tcPr>
-            <w:tcW w:w="4600" w:type="dxa"/>
-          </w:tcPr>
-          <w:p>
-            <w:r>
-              <w:rPr/>
-              <w:t xml:space="preserve">Implements GM's XM Discover query language from scratch: parser + evaluator for OR/AND/NOT, quoted phrases, wildcards (* ?), fuzzy (~), proximity ("a b"~3), and attribute searches. No pyspark import — that is what makes it portable.</w:t>
-            </w:r>
-          </w:p>
-        </w:tc>
-      </w:tr>
-      <w:tr>
-        <w:tc>
-          <w:tcPr>
-            <w:tcW w:w="4600" w:type="dxa"/>
-          </w:tcPr>
-          <w:p>
-            <w:r>
-              <w:rPr/>
-              <w:t xml:space="preserve">tagger.py</w:t>
-            </w:r>
-          </w:p>
-        </w:tc>
-        <w:tc>
-          <w:tcPr>
-            <w:tcW w:w="4600" w:type="dxa"/>
-          </w:tcPr>
-          <w:p>
-            <w:r>
-              <w:rPr/>
-              <w:t xml:space="preserve">Shared tagging core. Applies the global scope filter (English + audio + customer-side) then the four topic nodes to one sentence. Imported by both the local runner and the Spark job, guaranteeing identical logic.</w:t>
-            </w:r>
-          </w:p>
-        </w:tc>
-      </w:tr>
-      <w:tr>
-        <w:tc>
-          <w:tcPr>
-            <w:tcW w:w="4600" w:type="dxa"/>
-          </w:tcPr>
-          <w:p>
-            <w:r>
-              <w:rPr/>
-              <w:t xml:space="preserve">rules.json</w:t>
-            </w:r>
-          </w:p>
-        </w:tc>
-        <w:tc>
-          <w:tcPr>
-            <w:tcW w:w="4600" w:type="dxa"/>
-          </w:tcPr>
-          <w:p>
-            <w:r>
-              <w:rPr/>
-              <w:t xml:space="preserve">The topic hierarchy + all lane rules, expressed as data. This is what the engine reads.</w:t>
-            </w:r>
-          </w:p>
-        </w:tc>
-      </w:tr>
-      <w:tr>
-        <w:tc>
-          <w:tcPr>
-            <w:tcW w:w="4600" w:type="dxa"/>
-          </w:tcPr>
-          <w:p>
-            <w:r>
-              <w:rPr/>
-              <w:t xml:space="preserve">build_rules_config.py</w:t>
-            </w:r>
-          </w:p>
-        </w:tc>
-        <w:tc>
-          <w:tcPr>
-            <w:tcW w:w="4600" w:type="dxa"/>
-          </w:tcPr>
-          <w:p>
-            <w:r>
-              <w:rPr/>
-              <w:t xml:space="preserve">Generates rules.json by parsing GM's source Excel workbook, so the encoded rules provably match GM's originals rather than being hand-transcribed.</w:t>
+              <w:t xml:space="preserve">What it is / trade-offs</w:t>
+            </w:r>
+          </w:p>
+        </w:tc>
+      </w:tr>
+      <w:tr>
+        <w:tc>
+          <w:tcPr>
+            <w:tcW w:w="4600" w:type="dxa"/>
+          </w:tcPr>
+          <w:p>
+            <w:r>
+              <w:rPr/>
+              <w:t xml:space="preserve">1. Rule engine  (rule_engine.py, tagger.py, voc_topic_model_job.py)</w:t>
+            </w:r>
+          </w:p>
+        </w:tc>
+        <w:tc>
+          <w:tcPr>
+            <w:tcW w:w="4600" w:type="dxa"/>
+          </w:tcPr>
+          <w:p>
+            <w:r>
+              <w:rPr/>
+              <w:t xml:space="preserve">Faithful re-implementation of GM's XM Discover swim-lane rules. Deterministic, explainable, zero model cost, exact control replica. Trade-off: manual rule upkeep; misses novel phrasing.</w:t>
+            </w:r>
+          </w:p>
+        </w:tc>
+      </w:tr>
+      <w:tr>
+        <w:tc>
+          <w:tcPr>
+            <w:tcW w:w="4600" w:type="dxa"/>
+          </w:tcPr>
+          <w:p>
+            <w:r>
+              <w:rPr/>
+              <w:t xml:space="preserve">2. AI classification  (ai_classify_job.py)</w:t>
+            </w:r>
+          </w:p>
+        </w:tc>
+        <w:tc>
+          <w:tcPr>
+            <w:tcW w:w="4600" w:type="dxa"/>
+          </w:tcPr>
+          <w:p>
+            <w:r>
+              <w:rPr/>
+              <w:t xml:space="preserve">An LLM assigns each sentence to a topic via ai_classify, steered by the topic's business definition; ai_analyze_sentiment adds sentiment. No keyword maintenance; handles paraphrase. Trade-off: non-deterministic; per-call cost.</w:t>
+            </w:r>
+          </w:p>
+        </w:tc>
+      </w:tr>
+      <w:tr>
+        <w:tc>
+          <w:tcPr>
+            <w:tcW w:w="4600" w:type="dxa"/>
+          </w:tcPr>
+          <w:p>
+            <w:r>
+              <w:rPr/>
+              <w:t xml:space="preserve">3. Topic discovery  (topic_discovery_job.py)</w:t>
+            </w:r>
+          </w:p>
+        </w:tc>
+        <w:tc>
+          <w:tcPr>
+            <w:tcW w:w="4600" w:type="dxa"/>
+          </w:tcPr>
+          <w:p>
+            <w:r>
+              <w:rPr/>
+              <w:t xml:space="preserve">Unsupervised: ai_query embeds sentences, Spark MLlib KMeans clusters them by meaning, ai_gen auto-names themes. Finds themes nobody defined (the “global other” problem). Trade-off: clusters need interpretation.</w:t>
+            </w:r>
+          </w:p>
+        </w:tc>
+      </w:tr>
+      <w:tr>
+        <w:tc>
+          <w:tcPr>
+            <w:tcW w:w="4600" w:type="dxa"/>
+          </w:tcPr>
+          <w:p>
+            <w:r>
+              <w:rPr/>
+              <w:t xml:space="preserve">Comparison  (compare_approaches_job.py)</w:t>
+            </w:r>
+          </w:p>
+        </w:tc>
+        <w:tc>
+          <w:tcPr>
+            <w:tcW w:w="4600" w:type="dxa"/>
+          </w:tcPr>
+          <w:p>
+            <w:r>
+              <w:rPr/>
+              <w:t xml:space="preserve">Agreement analysis: rules vs. AI per topic (overlap, rule-only, AI-only, precision/recall/F1). The regression-vs-control deliverable.</w:t>
             </w:r>
           </w:p>
         </w:tc>
       </w:tr>
     </w:tbl>
     <w:p>
+      <w:r>
+        <w:rPr>
+          <w:b/>
+        </w:rPr>
+        <w:t xml:space="preserve">The AI classifier reads its topic definitions from the same rules.json the rule engine uses, so both tracks classify against identical topics.</w:t>
+      </w:r>
+    </w:p>
+    <w:p>
       <w:pPr>
         <w:pStyle w:val="Heading1"/>
       </w:pPr>
       <w:r>
         <w:rPr/>
-        <w:t xml:space="preserve">4. Files — runners</w:t>
+        <w:t xml:space="preserve">4. Files — rule engine (Track 1)</w:t>
       </w:r>
     </w:p>
     <w:tbl>
@@ -338,66 +358,90 @@
           <w:p>
             <w:r>
               <w:rPr/>
-              <w:t xml:space="preserve">voc_topic_model_job.py</w:t>
-            </w:r>
-          </w:p>
-        </w:tc>
-        <w:tc>
-          <w:tcPr>
-            <w:tcW w:w="4600" w:type="dxa"/>
-          </w:tcPr>
-          <w:p>
-            <w:r>
-              <w:rPr/>
-              <w:t xml:space="preserve">The production Databricks/PySpark job. Reads the two Delta tables, joins on natural_id, applies the rules via a vectorized pandas_udf, and writes the tagged output + frequency tables. Table names and dates are parameterized.</w:t>
-            </w:r>
-          </w:p>
-        </w:tc>
-      </w:tr>
-      <w:tr>
-        <w:tc>
-          <w:tcPr>
-            <w:tcW w:w="4600" w:type="dxa"/>
-          </w:tcPr>
-          <w:p>
-            <w:r>
-              <w:rPr/>
-              <w:t xml:space="preserve">run_job_notebook.py</w:t>
-            </w:r>
-          </w:p>
-        </w:tc>
-        <w:tc>
-          <w:tcPr>
-            <w:tcW w:w="4600" w:type="dxa"/>
-          </w:tcPr>
-          <w:p>
-            <w:r>
-              <w:rPr/>
-              <w:t xml:space="preserve">Thin notebook entrypoint the deployed Databricks job runs — imports the job module and calls run().</w:t>
-            </w:r>
-          </w:p>
-        </w:tc>
-      </w:tr>
-      <w:tr>
-        <w:tc>
-          <w:tcPr>
-            <w:tcW w:w="4600" w:type="dxa"/>
-          </w:tcPr>
-          <w:p>
-            <w:r>
-              <w:rPr/>
-              <w:t xml:space="preserve">run_local.py</w:t>
-            </w:r>
-          </w:p>
-        </w:tc>
-        <w:tc>
-          <w:tcPr>
-            <w:tcW w:w="4600" w:type="dxa"/>
-          </w:tcPr>
-          <w:p>
-            <w:r>
-              <w:rPr/>
-              <w:t xml:space="preserve">Stdlib-only local driver. Runs the same tagging over CSV files with no cluster needed — used to validate everything locally.</w:t>
+              <w:t xml:space="preserve">rule_engine.py</w:t>
+            </w:r>
+          </w:p>
+        </w:tc>
+        <w:tc>
+          <w:tcPr>
+            <w:tcW w:w="4600" w:type="dxa"/>
+          </w:tcPr>
+          <w:p>
+            <w:r>
+              <w:rPr/>
+              <w:t xml:space="preserve">Implements GM's XM Discover query language from scratch: parser + evaluator for OR/AND/NOT, quoted phrases, wildcards (* ?), fuzzy (~), proximity ("a b"~3), and attribute searches. No pyspark import — that is what makes it portable.</w:t>
+            </w:r>
+          </w:p>
+        </w:tc>
+      </w:tr>
+      <w:tr>
+        <w:tc>
+          <w:tcPr>
+            <w:tcW w:w="4600" w:type="dxa"/>
+          </w:tcPr>
+          <w:p>
+            <w:r>
+              <w:rPr/>
+              <w:t xml:space="preserve">tagger.py</w:t>
+            </w:r>
+          </w:p>
+        </w:tc>
+        <w:tc>
+          <w:tcPr>
+            <w:tcW w:w="4600" w:type="dxa"/>
+          </w:tcPr>
+          <w:p>
+            <w:r>
+              <w:rPr/>
+              <w:t xml:space="preserve">Shared tagging core. Applies the global scope filter (English + audio + customer-side) then the four topic nodes to one sentence. Imported by both the local runner and the Spark job, guaranteeing identical logic.</w:t>
+            </w:r>
+          </w:p>
+        </w:tc>
+      </w:tr>
+      <w:tr>
+        <w:tc>
+          <w:tcPr>
+            <w:tcW w:w="4600" w:type="dxa"/>
+          </w:tcPr>
+          <w:p>
+            <w:r>
+              <w:rPr/>
+              <w:t xml:space="preserve">rules.json</w:t>
+            </w:r>
+          </w:p>
+        </w:tc>
+        <w:tc>
+          <w:tcPr>
+            <w:tcW w:w="4600" w:type="dxa"/>
+          </w:tcPr>
+          <w:p>
+            <w:r>
+              <w:rPr/>
+              <w:t xml:space="preserve">The topic hierarchy + all lane rules, expressed as data. This is what the engine reads.</w:t>
+            </w:r>
+          </w:p>
+        </w:tc>
+      </w:tr>
+      <w:tr>
+        <w:tc>
+          <w:tcPr>
+            <w:tcW w:w="4600" w:type="dxa"/>
+          </w:tcPr>
+          <w:p>
+            <w:r>
+              <w:rPr/>
+              <w:t xml:space="preserve">build_rules_config.py</w:t>
+            </w:r>
+          </w:p>
+        </w:tc>
+        <w:tc>
+          <w:tcPr>
+            <w:tcW w:w="4600" w:type="dxa"/>
+          </w:tcPr>
+          <w:p>
+            <w:r>
+              <w:rPr/>
+              <w:t xml:space="preserve">Generates rules.json by parsing GM's source Excel workbook, so the encoded rules provably match GM's originals rather than being hand-transcribed.</w:t>
             </w:r>
           </w:p>
         </w:tc>
@@ -409,7 +453,7 @@
       </w:pPr>
       <w:r>
         <w:rPr/>
-        <w:t xml:space="preserve">5. Files — outputs &amp; validation</w:t>
+        <w:t xml:space="preserve">5. Files — rule-engine runners</w:t>
       </w:r>
     </w:p>
     <w:tbl>
@@ -463,66 +507,66 @@
           <w:p>
             <w:r>
               <w:rPr/>
-              <w:t xml:space="preserve">build_dashboard.py</w:t>
-            </w:r>
-          </w:p>
-        </w:tc>
-        <w:tc>
-          <w:tcPr>
-            <w:tcW w:w="4600" w:type="dxa"/>
-          </w:tcPr>
-          <w:p>
-            <w:r>
-              <w:rPr/>
-              <w:t xml:space="preserve">Renders a self-contained HTML review dashboard: topic frequencies and representative verbatims with matched-term “chicklets”.</w:t>
-            </w:r>
-          </w:p>
-        </w:tc>
-      </w:tr>
-      <w:tr>
-        <w:tc>
-          <w:tcPr>
-            <w:tcW w:w="4600" w:type="dxa"/>
-          </w:tcPr>
-          <w:p>
-            <w:r>
-              <w:rPr/>
-              <w:t xml:space="preserve">test_rule_engine.py</w:t>
-            </w:r>
-          </w:p>
-        </w:tc>
-        <w:tc>
-          <w:tcPr>
-            <w:tcW w:w="4600" w:type="dxa"/>
-          </w:tcPr>
-          <w:p>
-            <w:r>
-              <w:rPr/>
-              <w:t xml:space="preserve">33 unit tests covering every documented syntax rule. All passing.</w:t>
-            </w:r>
-          </w:p>
-        </w:tc>
-      </w:tr>
-      <w:tr>
-        <w:tc>
-          <w:tcPr>
-            <w:tcW w:w="4600" w:type="dxa"/>
-          </w:tcPr>
-          <w:p>
-            <w:r>
-              <w:rPr/>
-              <w:t xml:space="preserve">make_demo_fixture.py</w:t>
-            </w:r>
-          </w:p>
-        </w:tc>
-        <w:tc>
-          <w:tcPr>
-            <w:tcW w:w="4600" w:type="dxa"/>
-          </w:tcPr>
-          <w:p>
-            <w:r>
-              <w:rPr/>
-              <w:t xml:space="preserve">Builds schema-identical demo data with realistic verbatims — needed because the provided sample data is synthetic OnStar dialogue with no topical content to tag.</w:t>
+              <w:t xml:space="preserve">voc_topic_model_job.py</w:t>
+            </w:r>
+          </w:p>
+        </w:tc>
+        <w:tc>
+          <w:tcPr>
+            <w:tcW w:w="4600" w:type="dxa"/>
+          </w:tcPr>
+          <w:p>
+            <w:r>
+              <w:rPr/>
+              <w:t xml:space="preserve">The production Databricks/PySpark job. Reads the two Delta tables, joins on natural_id, applies the rules via a vectorized pandas_udf, and writes the tagged output + frequency tables. Table names and dates are parameterized.</w:t>
+            </w:r>
+          </w:p>
+        </w:tc>
+      </w:tr>
+      <w:tr>
+        <w:tc>
+          <w:tcPr>
+            <w:tcW w:w="4600" w:type="dxa"/>
+          </w:tcPr>
+          <w:p>
+            <w:r>
+              <w:rPr/>
+              <w:t xml:space="preserve">run_job_notebook.py</w:t>
+            </w:r>
+          </w:p>
+        </w:tc>
+        <w:tc>
+          <w:tcPr>
+            <w:tcW w:w="4600" w:type="dxa"/>
+          </w:tcPr>
+          <w:p>
+            <w:r>
+              <w:rPr/>
+              <w:t xml:space="preserve">Thin notebook entrypoint the deployed Databricks job runs — imports the job module and calls run().</w:t>
+            </w:r>
+          </w:p>
+        </w:tc>
+      </w:tr>
+      <w:tr>
+        <w:tc>
+          <w:tcPr>
+            <w:tcW w:w="4600" w:type="dxa"/>
+          </w:tcPr>
+          <w:p>
+            <w:r>
+              <w:rPr/>
+              <w:t xml:space="preserve">run_local.py</w:t>
+            </w:r>
+          </w:p>
+        </w:tc>
+        <w:tc>
+          <w:tcPr>
+            <w:tcW w:w="4600" w:type="dxa"/>
+          </w:tcPr>
+          <w:p>
+            <w:r>
+              <w:rPr/>
+              <w:t xml:space="preserve">Stdlib-only local driver. Runs the same tagging over CSV files with no cluster needed — used to validate everything locally.</w:t>
             </w:r>
           </w:p>
         </w:tc>
@@ -534,7 +578,7 @@
       </w:pPr>
       <w:r>
         <w:rPr/>
-        <w:t xml:space="preserve">6. Files — deployment &amp; docs</w:t>
+        <w:t xml:space="preserve">6. Files — ML / NLP track (Track 2)</w:t>
       </w:r>
     </w:p>
     <w:tbl>
@@ -588,6 +632,304 @@
           <w:p>
             <w:r>
               <w:rPr/>
+              <w:t xml:space="preserve">ai_classify_job.py</w:t>
+            </w:r>
+          </w:p>
+        </w:tc>
+        <w:tc>
+          <w:tcPr>
+            <w:tcW w:w="4600" w:type="dxa"/>
+          </w:tcPr>
+          <w:p>
+            <w:r>
+              <w:rPr/>
+              <w:t xml:space="preserve">AI topic classification. Uses ai_classify (LLM assigns each sentence to a topic, steered by the topic's business definition from rules.json) and ai_analyze_sentiment. Writes voc_ai_topic_tags.</w:t>
+            </w:r>
+          </w:p>
+        </w:tc>
+      </w:tr>
+      <w:tr>
+        <w:tc>
+          <w:tcPr>
+            <w:tcW w:w="4600" w:type="dxa"/>
+          </w:tcPr>
+          <w:p>
+            <w:r>
+              <w:rPr/>
+              <w:t xml:space="preserve">topic_discovery_job.py</w:t>
+            </w:r>
+          </w:p>
+        </w:tc>
+        <w:tc>
+          <w:tcPr>
+            <w:tcW w:w="4600" w:type="dxa"/>
+          </w:tcPr>
+          <w:p>
+            <w:r>
+              <w:rPr/>
+              <w:t xml:space="preserve">Unsupervised topic discovery. Embeds sentences via ai_query('databricks-gte-large-en'), clusters with Spark MLlib KMeans, auto-names themes with ai_gen. Writes voc_discovered_themes + voc_theme_assignments.</w:t>
+            </w:r>
+          </w:p>
+        </w:tc>
+      </w:tr>
+      <w:tr>
+        <w:tc>
+          <w:tcPr>
+            <w:tcW w:w="4600" w:type="dxa"/>
+          </w:tcPr>
+          <w:p>
+            <w:r>
+              <w:rPr/>
+              <w:t xml:space="preserve">compare_approaches_job.py</w:t>
+            </w:r>
+          </w:p>
+        </w:tc>
+        <w:tc>
+          <w:tcPr>
+            <w:tcW w:w="4600" w:type="dxa"/>
+          </w:tcPr>
+          <w:p>
+            <w:r>
+              <w:rPr/>
+              <w:t xml:space="preserve">Agreement analysis between the rule tags and AI tags per topic; precision/recall/F1 with the rule engine as proxy control. Writes voc_approach_comparison.</w:t>
+            </w:r>
+          </w:p>
+        </w:tc>
+      </w:tr>
+      <w:tr>
+        <w:tc>
+          <w:tcPr>
+            <w:tcW w:w="4600" w:type="dxa"/>
+          </w:tcPr>
+          <w:p>
+            <w:r>
+              <w:rPr/>
+              <w:t xml:space="preserve">run_ai_classify_notebook.py / run_topic_discovery_notebook.py / run_compare_notebook.py</w:t>
+            </w:r>
+          </w:p>
+        </w:tc>
+        <w:tc>
+          <w:tcPr>
+            <w:tcW w:w="4600" w:type="dxa"/>
+          </w:tcPr>
+          <w:p>
+            <w:r>
+              <w:rPr/>
+              <w:t xml:space="preserve">Thin Databricks notebook entrypoints for the three ML jobs.</w:t>
+            </w:r>
+          </w:p>
+        </w:tc>
+      </w:tr>
+      <w:tr>
+        <w:tc>
+          <w:tcPr>
+            <w:tcW w:w="4600" w:type="dxa"/>
+          </w:tcPr>
+          <w:p>
+            <w:r>
+              <w:rPr/>
+              <w:t xml:space="preserve">ML_APPROACH.md</w:t>
+            </w:r>
+          </w:p>
+        </w:tc>
+        <w:tc>
+          <w:tcPr>
+            <w:tcW w:w="4600" w:type="dxa"/>
+          </w:tcPr>
+          <w:p>
+            <w:r>
+              <w:rPr/>
+              <w:t xml:space="preserve">Documents the three approaches, requirements (serverless + DBR 18.2+), cost notes, output tables, and caveats to verify on first real run.</w:t>
+            </w:r>
+          </w:p>
+        </w:tc>
+      </w:tr>
+    </w:tbl>
+    <w:p>
+      <w:pPr>
+        <w:pStyle w:val="Heading1"/>
+      </w:pPr>
+      <w:r>
+        <w:rPr/>
+        <w:t xml:space="preserve">7. Files — outputs &amp; validation</w:t>
+      </w:r>
+    </w:p>
+    <w:tbl>
+      <w:tblPr>
+        <w:tblStyle w:val="TableGrid"/>
+        <w:tblW w:w="9200" w:type="dxa"/>
+        <w:tblBorders>
+          <w:top w:val="single" w:sz="4" w:color="CCCCCC"/>
+          <w:left w:val="single" w:sz="4" w:color="CCCCCC"/>
+          <w:bottom w:val="single" w:sz="4" w:color="CCCCCC"/>
+          <w:right w:val="single" w:sz="4" w:color="CCCCCC"/>
+          <w:insideH w:val="single" w:sz="4" w:color="CCCCCC"/>
+          <w:insideV w:val="single" w:sz="4" w:color="CCCCCC"/>
+        </w:tblBorders>
+      </w:tblPr>
+      <w:tr>
+        <w:tc>
+          <w:tcPr>
+            <w:tcW w:w="4600" w:type="dxa"/>
+            <w:shd w:val="clear" w:fill="DDE7F5"/>
+          </w:tcPr>
+          <w:p>
+            <w:r>
+              <w:rPr>
+                <w:b/>
+              </w:rPr>
+              <w:t xml:space="preserve">File</w:t>
+            </w:r>
+          </w:p>
+        </w:tc>
+        <w:tc>
+          <w:tcPr>
+            <w:tcW w:w="4600" w:type="dxa"/>
+            <w:shd w:val="clear" w:fill="DDE7F5"/>
+          </w:tcPr>
+          <w:p>
+            <w:r>
+              <w:rPr>
+                <w:b/>
+              </w:rPr>
+              <w:t xml:space="preserve">Purpose</w:t>
+            </w:r>
+          </w:p>
+        </w:tc>
+      </w:tr>
+      <w:tr>
+        <w:tc>
+          <w:tcPr>
+            <w:tcW w:w="4600" w:type="dxa"/>
+          </w:tcPr>
+          <w:p>
+            <w:r>
+              <w:rPr/>
+              <w:t xml:space="preserve">build_dashboard.py</w:t>
+            </w:r>
+          </w:p>
+        </w:tc>
+        <w:tc>
+          <w:tcPr>
+            <w:tcW w:w="4600" w:type="dxa"/>
+          </w:tcPr>
+          <w:p>
+            <w:r>
+              <w:rPr/>
+              <w:t xml:space="preserve">Renders a self-contained HTML review dashboard: topic frequencies and representative verbatims with matched-term “chicklets”.</w:t>
+            </w:r>
+          </w:p>
+        </w:tc>
+      </w:tr>
+      <w:tr>
+        <w:tc>
+          <w:tcPr>
+            <w:tcW w:w="4600" w:type="dxa"/>
+          </w:tcPr>
+          <w:p>
+            <w:r>
+              <w:rPr/>
+              <w:t xml:space="preserve">test_rule_engine.py</w:t>
+            </w:r>
+          </w:p>
+        </w:tc>
+        <w:tc>
+          <w:tcPr>
+            <w:tcW w:w="4600" w:type="dxa"/>
+          </w:tcPr>
+          <w:p>
+            <w:r>
+              <w:rPr/>
+              <w:t xml:space="preserve">33 unit tests covering every documented syntax rule. All passing.</w:t>
+            </w:r>
+          </w:p>
+        </w:tc>
+      </w:tr>
+      <w:tr>
+        <w:tc>
+          <w:tcPr>
+            <w:tcW w:w="4600" w:type="dxa"/>
+          </w:tcPr>
+          <w:p>
+            <w:r>
+              <w:rPr/>
+              <w:t xml:space="preserve">make_demo_fixture.py</w:t>
+            </w:r>
+          </w:p>
+        </w:tc>
+        <w:tc>
+          <w:tcPr>
+            <w:tcW w:w="4600" w:type="dxa"/>
+          </w:tcPr>
+          <w:p>
+            <w:r>
+              <w:rPr/>
+              <w:t xml:space="preserve">Builds schema-identical demo data with realistic verbatims — needed because the provided sample data is synthetic OnStar dialogue with no topical content to tag.</w:t>
+            </w:r>
+          </w:p>
+        </w:tc>
+      </w:tr>
+    </w:tbl>
+    <w:p>
+      <w:pPr>
+        <w:pStyle w:val="Heading1"/>
+      </w:pPr>
+      <w:r>
+        <w:rPr/>
+        <w:t xml:space="preserve">8. Files — deployment &amp; docs</w:t>
+      </w:r>
+    </w:p>
+    <w:tbl>
+      <w:tblPr>
+        <w:tblStyle w:val="TableGrid"/>
+        <w:tblW w:w="9200" w:type="dxa"/>
+        <w:tblBorders>
+          <w:top w:val="single" w:sz="4" w:color="CCCCCC"/>
+          <w:left w:val="single" w:sz="4" w:color="CCCCCC"/>
+          <w:bottom w:val="single" w:sz="4" w:color="CCCCCC"/>
+          <w:right w:val="single" w:sz="4" w:color="CCCCCC"/>
+          <w:insideH w:val="single" w:sz="4" w:color="CCCCCC"/>
+          <w:insideV w:val="single" w:sz="4" w:color="CCCCCC"/>
+        </w:tblBorders>
+      </w:tblPr>
+      <w:tr>
+        <w:tc>
+          <w:tcPr>
+            <w:tcW w:w="4600" w:type="dxa"/>
+            <w:shd w:val="clear" w:fill="DDE7F5"/>
+          </w:tcPr>
+          <w:p>
+            <w:r>
+              <w:rPr>
+                <w:b/>
+              </w:rPr>
+              <w:t xml:space="preserve">File</w:t>
+            </w:r>
+          </w:p>
+        </w:tc>
+        <w:tc>
+          <w:tcPr>
+            <w:tcW w:w="4600" w:type="dxa"/>
+            <w:shd w:val="clear" w:fill="DDE7F5"/>
+          </w:tcPr>
+          <w:p>
+            <w:r>
+              <w:rPr>
+                <w:b/>
+              </w:rPr>
+              <w:t xml:space="preserve">Purpose</w:t>
+            </w:r>
+          </w:p>
+        </w:tc>
+      </w:tr>
+      <w:tr>
+        <w:tc>
+          <w:tcPr>
+            <w:tcW w:w="4600" w:type="dxa"/>
+          </w:tcPr>
+          <w:p>
+            <w:r>
+              <w:rPr/>
               <w:t xml:space="preserve">databricks.yml</w:t>
             </w:r>
           </w:p>
@@ -599,7 +941,7 @@
           <w:p>
             <w:r>
               <w:rPr/>
-              <w:t xml:space="preserve">Databricks Asset Bundle — defines the job as a serverless task and deploys it. Deployed to the daria_k_sandbox workspace.</w:t>
+              <w:t xml:space="preserve">Databricks Asset Bundle — defines two jobs (voc_topic_model_job for rules; voc_ai_pipeline_job for AI classify + discovery + compare) as serverless tasks. Deployed to the daria_k_sandbox workspace.</w:t>
             </w:r>
           </w:p>
         </w:tc>
@@ -636,6 +978,30 @@
           <w:p>
             <w:r>
               <w:rPr/>
+              <w:t xml:space="preserve">ML_APPROACH.md</w:t>
+            </w:r>
+          </w:p>
+        </w:tc>
+        <w:tc>
+          <w:tcPr>
+            <w:tcW w:w="4600" w:type="dxa"/>
+          </w:tcPr>
+          <w:p>
+            <w:r>
+              <w:rPr/>
+              <w:t xml:space="preserve">The three-approach ML strategy and AI-track details.</w:t>
+            </w:r>
+          </w:p>
+        </w:tc>
+      </w:tr>
+      <w:tr>
+        <w:tc>
+          <w:tcPr>
+            <w:tcW w:w="4600" w:type="dxa"/>
+          </w:tcPr>
+          <w:p>
+            <w:r>
+              <w:rPr/>
               <w:t xml:space="preserve">VALIDATION_SUMMARY.md</w:t>
             </w:r>
           </w:p>
@@ -660,6 +1026,30 @@
           <w:p>
             <w:r>
               <w:rPr/>
+              <w:t xml:space="preserve">architecture_diagram.html</w:t>
+            </w:r>
+          </w:p>
+        </w:tc>
+        <w:tc>
+          <w:tcPr>
+            <w:tcW w:w="4600" w:type="dxa"/>
+          </w:tcPr>
+          <w:p>
+            <w:r>
+              <w:rPr/>
+              <w:t xml:space="preserve">Rendered component map + runtime flow diagrams for both tracks.</w:t>
+            </w:r>
+          </w:p>
+        </w:tc>
+      </w:tr>
+      <w:tr>
+        <w:tc>
+          <w:tcPr>
+            <w:tcW w:w="4600" w:type="dxa"/>
+          </w:tcPr>
+          <w:p>
+            <w:r>
+              <w:rPr/>
               <w:t xml:space="preserve">.gitignore</w:t>
             </w:r>
           </w:p>
@@ -683,7 +1073,7 @@
       </w:pPr>
       <w:r>
         <w:rPr/>
-        <w:t xml:space="preserve">7. Key findings</w:t>
+        <w:t xml:space="preserve">9. Key findings</w:t>
       </w:r>
     </w:p>
     <w:p>
@@ -739,45 +1129,79 @@
     </w:p>
     <w:p>
       <w:pPr>
+        <w:numPr>
+          <w:ilvl w:val="0"/>
+          <w:numId w:val="0"/>
+        </w:numPr>
+        <w:ind w:left="360" w:hanging="180"/>
+      </w:pPr>
+      <w:r>
+        <w:rPr/>
+        <w:t xml:space="preserve">•  </w:t>
+      </w:r>
+      <w:r>
+        <w:rPr/>
+        <w:t xml:space="preserve">ML-track caveats to verify on first real run: the ai_classify v2.x return shape (struct vs. string) and the embedding return format are runtime-sensitive (handled defensively in code), and the AI functions require serverless compute + DBR 18.2+ and are pay-per-token.</w:t>
+      </w:r>
+    </w:p>
+    <w:p>
+      <w:pPr>
         <w:pStyle w:val="Heading1"/>
       </w:pPr>
       <w:r>
         <w:rPr/>
-        <w:t xml:space="preserve">8. Status</w:t>
-      </w:r>
-    </w:p>
-    <w:p>
-      <w:pPr>
-        <w:numPr>
-          <w:ilvl w:val="0"/>
-          <w:numId w:val="0"/>
-        </w:numPr>
-        <w:ind w:left="360" w:hanging="180"/>
-      </w:pPr>
-      <w:r>
-        <w:rPr/>
-        <w:t xml:space="preserve">•  </w:t>
-      </w:r>
-      <w:r>
-        <w:rPr/>
-        <w:t xml:space="preserve">Built, tested (33/33), validated end-to-end locally.</w:t>
-      </w:r>
-    </w:p>
-    <w:p>
-      <w:pPr>
-        <w:numPr>
-          <w:ilvl w:val="0"/>
-          <w:numId w:val="0"/>
-        </w:numPr>
-        <w:ind w:left="360" w:hanging="180"/>
-      </w:pPr>
-      <w:r>
-        <w:rPr/>
-        <w:t xml:space="preserve">•  </w:t>
-      </w:r>
-      <w:r>
-        <w:rPr/>
-        <w:t xml:space="preserve">Deployed to Databricks (daria_k_sandbox) as an Asset Bundle.</w:t>
+        <w:t xml:space="preserve">10. Status</w:t>
+      </w:r>
+    </w:p>
+    <w:p>
+      <w:pPr>
+        <w:numPr>
+          <w:ilvl w:val="0"/>
+          <w:numId w:val="0"/>
+        </w:numPr>
+        <w:ind w:left="360" w:hanging="180"/>
+      </w:pPr>
+      <w:r>
+        <w:rPr/>
+        <w:t xml:space="preserve">•  </w:t>
+      </w:r>
+      <w:r>
+        <w:rPr/>
+        <w:t xml:space="preserve">Track 1 (rules): built, tested (33/33), validated end-to-end locally.</w:t>
+      </w:r>
+    </w:p>
+    <w:p>
+      <w:pPr>
+        <w:numPr>
+          <w:ilvl w:val="0"/>
+          <w:numId w:val="0"/>
+        </w:numPr>
+        <w:ind w:left="360" w:hanging="180"/>
+      </w:pPr>
+      <w:r>
+        <w:rPr/>
+        <w:t xml:space="preserve">•  </w:t>
+      </w:r>
+      <w:r>
+        <w:rPr/>
+        <w:t xml:space="preserve">Track 2 (ML/NLP): ai_classify, topic-discovery, and comparison jobs built and compile; wired into the bundle.</w:t>
+      </w:r>
+    </w:p>
+    <w:p>
+      <w:pPr>
+        <w:numPr>
+          <w:ilvl w:val="0"/>
+          <w:numId w:val="0"/>
+        </w:numPr>
+        <w:ind w:left="360" w:hanging="180"/>
+      </w:pPr>
+      <w:r>
+        <w:rPr/>
+        <w:t xml:space="preserve">•  </w:t>
+      </w:r>
+      <w:r>
+        <w:rPr/>
+        <w:t xml:space="preserve">Both jobs deployed to Databricks (daria_k_sandbox) as an Asset Bundle.</w:t>
       </w:r>
     </w:p>
     <w:p>
@@ -811,7 +1235,7 @@
       </w:r>
       <w:r>
         <w:rPr/>
-        <w:t xml:space="preserve">Pending: final force-push of the cleaned code to GitHub.</w:t>
+        <w:t xml:space="preserve">Pending: run the ML pipeline against real input tables (needs the daria_krasavina.gm_voc tables loaded).</w:t>
       </w:r>
     </w:p>
     <w:p>
@@ -820,58 +1244,75 @@
       </w:pPr>
       <w:r>
         <w:rPr/>
-        <w:t xml:space="preserve">9. Recommended next steps</w:t>
-      </w:r>
-    </w:p>
-    <w:p>
-      <w:pPr>
-        <w:numPr>
-          <w:ilvl w:val="0"/>
-          <w:numId w:val="0"/>
-        </w:numPr>
-        <w:ind w:left="360" w:hanging="180"/>
-      </w:pPr>
-      <w:r>
-        <w:rPr/>
-        <w:t xml:space="preserve">•  </w:t>
-      </w:r>
-      <w:r>
-        <w:rPr/>
-        <w:t xml:space="preserve">Load real, de-identified representative data into the POC schema and rerun the job.</w:t>
-      </w:r>
-    </w:p>
-    <w:p>
-      <w:pPr>
-        <w:numPr>
-          <w:ilvl w:val="0"/>
-          <w:numId w:val="0"/>
-        </w:numPr>
-        <w:ind w:left="360" w:hanging="180"/>
-      </w:pPr>
-      <w:r>
-        <w:rPr/>
-        <w:t xml:space="preserve">•  </w:t>
-      </w:r>
-      <w:r>
-        <w:rPr/>
-        <w:t xml:space="preserve">Join the Databricks tags to the XM Discover control tags per node for a precision/recall comparison.</w:t>
-      </w:r>
-    </w:p>
-    <w:p>
-      <w:pPr>
-        <w:numPr>
-          <w:ilvl w:val="0"/>
-          <w:numId w:val="0"/>
-        </w:numPr>
-        <w:ind w:left="360" w:hanging="180"/>
-      </w:pPr>
-      <w:r>
-        <w:rPr/>
-        <w:t xml:space="preserve">•  </w:t>
-      </w:r>
-      <w:r>
-        <w:rPr/>
-        <w:t xml:space="preserve">Capture cost (DBU) and throughput at target volume for the scaling story; run the rerun-after-rule-change repeatability benchmark.</w:t>
+        <w:t xml:space="preserve">11. Recommended next steps</w:t>
+      </w:r>
+    </w:p>
+    <w:p>
+      <w:pPr>
+        <w:numPr>
+          <w:ilvl w:val="0"/>
+          <w:numId w:val="0"/>
+        </w:numPr>
+        <w:ind w:left="360" w:hanging="180"/>
+      </w:pPr>
+      <w:r>
+        <w:rPr/>
+        <w:t xml:space="preserve">•  </w:t>
+      </w:r>
+      <w:r>
+        <w:rPr/>
+        <w:t xml:space="preserve">Load real, de-identified representative data into the POC schema and rerun both tracks.</w:t>
+      </w:r>
+    </w:p>
+    <w:p>
+      <w:pPr>
+        <w:numPr>
+          <w:ilvl w:val="0"/>
+          <w:numId w:val="0"/>
+        </w:numPr>
+        <w:ind w:left="360" w:hanging="180"/>
+      </w:pPr>
+      <w:r>
+        <w:rPr/>
+        <w:t xml:space="preserve">•  </w:t>
+      </w:r>
+      <w:r>
+        <w:rPr/>
+        <w:t xml:space="preserve">Compare AI classifier and rule engine against GM's XM Discover control tags per node (precision/recall).</w:t>
+      </w:r>
+    </w:p>
+    <w:p>
+      <w:pPr>
+        <w:numPr>
+          <w:ilvl w:val="0"/>
+          <w:numId w:val="0"/>
+        </w:numPr>
+        <w:ind w:left="360" w:hanging="180"/>
+      </w:pPr>
+      <w:r>
+        <w:rPr/>
+        <w:t xml:space="preserve">•  </w:t>
+      </w:r>
+      <w:r>
+        <w:rPr/>
+        <w:t xml:space="preserve">Review the discovered themes with SMEs to identify emergent topics beyond the four defined nodes.</w:t>
+      </w:r>
+    </w:p>
+    <w:p>
+      <w:pPr>
+        <w:numPr>
+          <w:ilvl w:val="0"/>
+          <w:numId w:val="0"/>
+        </w:numPr>
+        <w:ind w:left="360" w:hanging="180"/>
+      </w:pPr>
+      <w:r>
+        <w:rPr/>
+        <w:t xml:space="preserve">•  </w:t>
+      </w:r>
+      <w:r>
+        <w:rPr/>
+        <w:t xml:space="preserve">Capture cost (DBU + AI-function token cost) and throughput at target volume; run the rerun repeatability benchmark.</w:t>
       </w:r>
     </w:p>
     <w:p>

</xml_diff>